<commit_message>
Guardo mis diagramas locales antes del pull
</commit_message>
<xml_diff>
--- a/1.COMPOENTES_METODOLOGICOS/IEEE/versiones anteriores/Identificación del requerimiento - copia.docx
+++ b/1.COMPOENTES_METODOLOGICOS/IEEE/versiones anteriores/Identificación del requerimiento - copia.docx
@@ -1,6 +1,6 @@
 
 <file path=word/document.xml><?xml version="1.0" encoding="utf-8"?>
-<w:document xmlns:wpc="http://schemas.microsoft.com/office/word/2010/wordprocessingCanvas" xmlns:cx="http://schemas.microsoft.com/office/drawing/2014/chartex" xmlns:cx1="http://schemas.microsoft.com/office/drawing/2015/9/8/chartex" xmlns:cx2="http://schemas.microsoft.com/office/drawing/2015/10/21/chartex" xmlns:cx3="http://schemas.microsoft.com/office/drawing/2016/5/9/chartex" xmlns:cx4="http://schemas.microsoft.com/office/drawing/2016/5/10/chartex" xmlns:cx5="http://schemas.microsoft.com/office/drawing/2016/5/11/chartex" xmlns:cx6="http://schemas.microsoft.com/office/drawing/2016/5/12/chartex" xmlns:cx7="http://schemas.microsoft.com/office/drawing/2016/5/13/chartex" xmlns:cx8="http://schemas.microsoft.com/office/drawing/2016/5/14/chartex" xmlns:mc="http://schemas.openxmlformats.org/markup-compatibility/2006" xmlns:aink="http://schemas.microsoft.com/office/drawing/2016/ink" xmlns:am3d="http://schemas.microsoft.com/office/drawing/2017/model3d" xmlns:o="urn:schemas-microsoft-com:office:office" xmlns:oel="http://schemas.microsoft.com/office/2019/extlst" xmlns:r="http://schemas.openxmlformats.org/officeDocument/2006/relationships" xmlns:m="http://schemas.openxmlformats.org/officeDocument/2006/math" xmlns:v="urn:schemas-microsoft-com:vml" xmlns:wp14="http://schemas.microsoft.com/office/word/2010/wordprocessingDrawing" xmlns:wp="http://schemas.openxmlformats.org/drawingml/2006/wordprocessingDrawing" xmlns:w10="urn:schemas-microsoft-com:office:word" xmlns:w="http://schemas.openxmlformats.org/wordprocessingml/2006/main" xmlns:w14="http://schemas.microsoft.com/office/word/2010/wordml" xmlns:w15="http://schemas.microsoft.com/office/word/2012/wordml" xmlns:w16cex="http://schemas.microsoft.com/office/word/2018/wordml/cex" xmlns:w16cid="http://schemas.microsoft.com/office/word/2016/wordml/cid" xmlns:w16="http://schemas.microsoft.com/office/word/2018/wordml" xmlns:w16sdtdh="http://schemas.microsoft.com/office/word/2020/wordml/sdtdatahash" xmlns:w16se="http://schemas.microsoft.com/office/word/2015/wordml/symex" xmlns:wpg="http://schemas.microsoft.com/office/word/2010/wordprocessingGroup" xmlns:wpi="http://schemas.microsoft.com/office/word/2010/wordprocessingInk" xmlns:wne="http://schemas.microsoft.com/office/word/2006/wordml" xmlns:wps="http://schemas.microsoft.com/office/word/2010/wordprocessingShape" mc:Ignorable="w14 w15 w16se w16cid w16 w16cex w16sdtdh wp14">
+<w:document xmlns:wpc="http://schemas.microsoft.com/office/word/2010/wordprocessingCanvas" xmlns:cx="http://schemas.microsoft.com/office/drawing/2014/chartex" xmlns:cx1="http://schemas.microsoft.com/office/drawing/2015/9/8/chartex" xmlns:cx2="http://schemas.microsoft.com/office/drawing/2015/10/21/chartex" xmlns:cx3="http://schemas.microsoft.com/office/drawing/2016/5/9/chartex" xmlns:cx4="http://schemas.microsoft.com/office/drawing/2016/5/10/chartex" xmlns:cx5="http://schemas.microsoft.com/office/drawing/2016/5/11/chartex" xmlns:cx6="http://schemas.microsoft.com/office/drawing/2016/5/12/chartex" xmlns:cx7="http://schemas.microsoft.com/office/drawing/2016/5/13/chartex" xmlns:cx8="http://schemas.microsoft.com/office/drawing/2016/5/14/chartex" xmlns:mc="http://schemas.openxmlformats.org/markup-compatibility/2006" xmlns:aink="http://schemas.microsoft.com/office/drawing/2016/ink" xmlns:am3d="http://schemas.microsoft.com/office/drawing/2017/model3d" xmlns:o="urn:schemas-microsoft-com:office:office" xmlns:oel="http://schemas.microsoft.com/office/2019/extlst" xmlns:r="http://schemas.openxmlformats.org/officeDocument/2006/relationships" xmlns:m="http://schemas.openxmlformats.org/officeDocument/2006/math" xmlns:v="urn:schemas-microsoft-com:vml" xmlns:wp14="http://schemas.microsoft.com/office/word/2010/wordprocessingDrawing" xmlns:wp="http://schemas.openxmlformats.org/drawingml/2006/wordprocessingDrawing" xmlns:w10="urn:schemas-microsoft-com:office:word" xmlns:w="http://schemas.openxmlformats.org/wordprocessingml/2006/main" xmlns:w14="http://schemas.microsoft.com/office/word/2010/wordml" xmlns:w15="http://schemas.microsoft.com/office/word/2012/wordml" xmlns:w16cex="http://schemas.microsoft.com/office/word/2018/wordml/cex" xmlns:w16cid="http://schemas.microsoft.com/office/word/2016/wordml/cid" xmlns:w16="http://schemas.microsoft.com/office/word/2018/wordml" xmlns:w16du="http://schemas.microsoft.com/office/word/2023/wordml/word16du" xmlns:w16sdtdh="http://schemas.microsoft.com/office/word/2020/wordml/sdtdatahash" xmlns:w16sdtfl="http://schemas.microsoft.com/office/word/2024/wordml/sdtformatlock" xmlns:w16se="http://schemas.microsoft.com/office/word/2015/wordml/symex" xmlns:wpg="http://schemas.microsoft.com/office/word/2010/wordprocessingGroup" xmlns:wpi="http://schemas.microsoft.com/office/word/2010/wordprocessingInk" xmlns:wne="http://schemas.microsoft.com/office/word/2006/wordml" xmlns:wps="http://schemas.microsoft.com/office/word/2010/wordprocessingShape" mc:Ignorable="w14 w15 w16se w16cid w16 w16cex w16sdtdh w16sdtfl w16du wp14">
   <w:body>
     <w:tbl>
       <w:tblPr>
@@ -447,8 +447,8 @@
         <w:tblLook w:val="04A0" w:firstRow="1" w:lastRow="0" w:firstColumn="1" w:lastColumn="0" w:noHBand="0" w:noVBand="1"/>
       </w:tblPr>
       <w:tblGrid>
-        <w:gridCol w:w="2137"/>
-        <w:gridCol w:w="6691"/>
+        <w:gridCol w:w="2601"/>
+        <w:gridCol w:w="6227"/>
       </w:tblGrid>
       <w:tr>
         <w:trPr>
@@ -594,27 +594,38 @@
           </w:tcPr>
           <w:p>
             <w:r>
-              <w:t>El sistema permitirá al cliente iniciar sesión mediante su correo electrónico y contraseña. El sistema verificará que las credenciales ingresadas sean válidas y que la cuenta se encuentre activa. En caso de que los datos sean incorrectos, el sistema informará el error y solicitará un nuevo intento de autenticación.</w:t>
-            </w:r>
-          </w:p>
-        </w:tc>
-      </w:tr>
-      <w:tr>
-        <w:trPr>
-          <w:tblCellSpacing w:w="15" w:type="dxa"/>
-        </w:trPr>
-        <w:tc>
-          <w:tcPr>
-            <w:tcW w:w="0" w:type="auto"/>
-            <w:vAlign w:val="center"/>
-            <w:hideMark/>
-          </w:tcPr>
-          <w:p>
-            <w:r>
-              <w:rPr>
-                <w:b/>
-                <w:bCs/>
-              </w:rPr>
+              <w:t>El sistema permitirá al cliente iniciar sesión mediante su correo electrónico y contraseña.</w:t>
+            </w:r>
+          </w:p>
+          <w:p>
+            <w:r>
+              <w:t xml:space="preserve"> El sistema verificará que las credenciales ingresadas sean válidas y que la cuenta se encuentre activa.</w:t>
+            </w:r>
+          </w:p>
+          <w:p>
+            <w:r>
+              <w:t xml:space="preserve"> En caso de que los datos sean incorrectos, el sistema informará el error y solicitará un nuevo intento de autenticación.</w:t>
+            </w:r>
+          </w:p>
+        </w:tc>
+      </w:tr>
+      <w:tr>
+        <w:trPr>
+          <w:tblCellSpacing w:w="15" w:type="dxa"/>
+        </w:trPr>
+        <w:tc>
+          <w:tcPr>
+            <w:tcW w:w="0" w:type="auto"/>
+            <w:vAlign w:val="center"/>
+            <w:hideMark/>
+          </w:tcPr>
+          <w:p>
+            <w:r>
+              <w:rPr>
+                <w:b/>
+                <w:bCs/>
+              </w:rPr>
+              <w:lastRenderedPageBreak/>
               <w:t>Requerimientos NO funcionales:</w:t>
             </w:r>
           </w:p>
@@ -1026,27 +1037,32 @@
           </w:tcPr>
           <w:p>
             <w:r>
-              <w:t>El sistema permitirá al cliente solicitar la recuperación de su contraseña mediante el correo electrónico registrado. Si el correo se encuentra asociado a una cuenta activa, el sistema enviará un mensaje con las instrucciones necesarias para restablecer la contraseña.</w:t>
-            </w:r>
-          </w:p>
-        </w:tc>
-      </w:tr>
-      <w:tr>
-        <w:trPr>
-          <w:tblCellSpacing w:w="15" w:type="dxa"/>
-        </w:trPr>
-        <w:tc>
-          <w:tcPr>
-            <w:tcW w:w="0" w:type="auto"/>
-            <w:vAlign w:val="center"/>
-            <w:hideMark/>
-          </w:tcPr>
-          <w:p>
-            <w:r>
-              <w:rPr>
-                <w:b/>
-                <w:bCs/>
-              </w:rPr>
+              <w:t xml:space="preserve">El sistema permitirá al cliente solicitar la recuperación de su contraseña mediante el correo electrónico registrado. Si el </w:t>
+            </w:r>
+            <w:r>
+              <w:lastRenderedPageBreak/>
+              <w:t>correo se encuentra asociado a una cuenta activa, el sistema enviará un mensaje con las instrucciones necesarias para restablecer la contraseña.</w:t>
+            </w:r>
+          </w:p>
+        </w:tc>
+      </w:tr>
+      <w:tr>
+        <w:trPr>
+          <w:tblCellSpacing w:w="15" w:type="dxa"/>
+        </w:trPr>
+        <w:tc>
+          <w:tcPr>
+            <w:tcW w:w="0" w:type="auto"/>
+            <w:vAlign w:val="center"/>
+            <w:hideMark/>
+          </w:tcPr>
+          <w:p>
+            <w:r>
+              <w:rPr>
+                <w:b/>
+                <w:bCs/>
+              </w:rPr>
+              <w:lastRenderedPageBreak/>
               <w:t>Requerimientos NO funcionales:</w:t>
             </w:r>
           </w:p>
@@ -1430,6 +1446,7 @@
                 <w:b/>
                 <w:bCs/>
               </w:rPr>
+              <w:lastRenderedPageBreak/>
               <w:t>Descripción del requerimiento:</w:t>
             </w:r>
           </w:p>
@@ -1529,7 +1546,6 @@
                 <w:b/>
                 <w:bCs/>
               </w:rPr>
-              <w:lastRenderedPageBreak/>
               <w:t>Identificación del requerimiento:</w:t>
             </w:r>
           </w:p>
@@ -1865,6 +1881,7 @@
                 <w:b/>
                 <w:bCs/>
               </w:rPr>
+              <w:lastRenderedPageBreak/>
               <w:t>Descripción del requerimiento:</w:t>
             </w:r>
           </w:p>
@@ -1964,7 +1981,6 @@
                 <w:b/>
                 <w:bCs/>
               </w:rPr>
-              <w:lastRenderedPageBreak/>
               <w:t>Identificación del requerimiento:</w:t>
             </w:r>
           </w:p>
@@ -2173,6 +2189,7 @@
                 <w:b/>
                 <w:bCs/>
               </w:rPr>
+              <w:lastRenderedPageBreak/>
               <w:t>Identificación del requerimiento:</w:t>
             </w:r>
           </w:p>
@@ -2381,7 +2398,6 @@
                 <w:b/>
                 <w:bCs/>
               </w:rPr>
-              <w:lastRenderedPageBreak/>
               <w:t>Identificación del requerimiento:</w:t>
             </w:r>
           </w:p>
@@ -2590,6 +2606,7 @@
                 <w:b/>
                 <w:bCs/>
               </w:rPr>
+              <w:lastRenderedPageBreak/>
               <w:t>Identificación del requerimiento:</w:t>
             </w:r>
           </w:p>
@@ -2798,7 +2815,6 @@
                 <w:b/>
                 <w:bCs/>
               </w:rPr>
-              <w:lastRenderedPageBreak/>
               <w:t>Identificación del requerimiento:</w:t>
             </w:r>
           </w:p>
@@ -3007,6 +3023,7 @@
                 <w:b/>
                 <w:bCs/>
               </w:rPr>
+              <w:lastRenderedPageBreak/>
               <w:t>Identificación del requerimiento:</w:t>
             </w:r>
           </w:p>
@@ -3215,7 +3232,6 @@
                 <w:b/>
                 <w:bCs/>
               </w:rPr>
-              <w:lastRenderedPageBreak/>
               <w:t>Identificación del requerimiento:</w:t>
             </w:r>
           </w:p>
@@ -3424,6 +3440,7 @@
                 <w:b/>
                 <w:bCs/>
               </w:rPr>
+              <w:lastRenderedPageBreak/>
               <w:t>Identificación del requerimiento:</w:t>
             </w:r>
           </w:p>
@@ -3632,7 +3649,6 @@
                 <w:b/>
                 <w:bCs/>
               </w:rPr>
-              <w:lastRenderedPageBreak/>
               <w:t>Identificación del requerimiento:</w:t>
             </w:r>
           </w:p>
@@ -3841,6 +3857,7 @@
                 <w:b/>
                 <w:bCs/>
               </w:rPr>
+              <w:lastRenderedPageBreak/>
               <w:t>Identificación del requerimiento:</w:t>
             </w:r>
           </w:p>
@@ -4049,7 +4066,6 @@
                 <w:b/>
                 <w:bCs/>
               </w:rPr>
-              <w:lastRenderedPageBreak/>
               <w:t>Identificación del requerimiento:</w:t>
             </w:r>
           </w:p>
@@ -4258,6 +4274,7 @@
                 <w:b/>
                 <w:bCs/>
               </w:rPr>
+              <w:lastRenderedPageBreak/>
               <w:t>Identificación del requerimiento:</w:t>
             </w:r>
           </w:p>
@@ -4466,7 +4483,6 @@
                 <w:b/>
                 <w:bCs/>
               </w:rPr>
-              <w:lastRenderedPageBreak/>
               <w:t>Identificación del requerimiento:</w:t>
             </w:r>
           </w:p>
@@ -4675,6 +4691,7 @@
                 <w:b/>
                 <w:bCs/>
               </w:rPr>
+              <w:lastRenderedPageBreak/>
               <w:t>Identificación del requerimiento:</w:t>
             </w:r>
           </w:p>
@@ -4883,7 +4900,6 @@
                 <w:b/>
                 <w:bCs/>
               </w:rPr>
-              <w:lastRenderedPageBreak/>
               <w:t>Identificación del requerimiento:</w:t>
             </w:r>
           </w:p>
@@ -5092,6 +5108,7 @@
                 <w:b/>
                 <w:bCs/>
               </w:rPr>
+              <w:lastRenderedPageBreak/>
               <w:t>Identificación del requerimiento:</w:t>
             </w:r>
           </w:p>
@@ -5300,7 +5317,6 @@
                 <w:b/>
                 <w:bCs/>
               </w:rPr>
-              <w:lastRenderedPageBreak/>
               <w:t>Identificación del requerimiento:</w:t>
             </w:r>
           </w:p>
@@ -5515,6 +5531,7 @@
                 <w:b/>
                 <w:bCs/>
               </w:rPr>
+              <w:lastRenderedPageBreak/>
               <w:t>Identificación del requerimiento:</w:t>
             </w:r>
           </w:p>
@@ -5723,7 +5740,6 @@
                 <w:b/>
                 <w:bCs/>
               </w:rPr>
-              <w:lastRenderedPageBreak/>
               <w:t>Identificación del requerimiento:</w:t>
             </w:r>
           </w:p>
@@ -5932,6 +5948,7 @@
                 <w:b/>
                 <w:bCs/>
               </w:rPr>
+              <w:lastRenderedPageBreak/>
               <w:t>Identificación del requerimiento:</w:t>
             </w:r>
           </w:p>
@@ -6140,7 +6157,6 @@
                 <w:b/>
                 <w:bCs/>
               </w:rPr>
-              <w:lastRenderedPageBreak/>
               <w:t>Identificación del requerimiento:</w:t>
             </w:r>
           </w:p>
@@ -6349,6 +6365,7 @@
                 <w:b/>
                 <w:bCs/>
               </w:rPr>
+              <w:lastRenderedPageBreak/>
               <w:t>Identificación del requerimiento:</w:t>
             </w:r>
           </w:p>
@@ -6558,7 +6575,6 @@
                 <w:b/>
                 <w:bCs/>
               </w:rPr>
-              <w:lastRenderedPageBreak/>
               <w:t>Identificación del requerimiento:</w:t>
             </w:r>
           </w:p>
@@ -6843,6 +6859,7 @@
                 <w:b/>
                 <w:bCs/>
               </w:rPr>
+              <w:lastRenderedPageBreak/>
               <w:t>Características:</w:t>
             </w:r>
           </w:p>
@@ -6976,7 +6993,6 @@
                 <w:b/>
                 <w:bCs/>
               </w:rPr>
-              <w:lastRenderedPageBreak/>
               <w:t>Identificación del requerimiento:</w:t>
             </w:r>
           </w:p>
@@ -7185,6 +7201,7 @@
                 <w:b/>
                 <w:bCs/>
               </w:rPr>
+              <w:lastRenderedPageBreak/>
               <w:t>Identificación del requerimiento:</w:t>
             </w:r>
           </w:p>
@@ -7393,7 +7410,6 @@
                 <w:b/>
                 <w:bCs/>
               </w:rPr>
-              <w:lastRenderedPageBreak/>
               <w:t>Identificación del requerimiento:</w:t>
             </w:r>
           </w:p>
@@ -7678,6 +7694,7 @@
                 <w:b/>
                 <w:bCs/>
               </w:rPr>
+              <w:lastRenderedPageBreak/>
               <w:t>Características:</w:t>
             </w:r>
           </w:p>
@@ -7811,7 +7828,6 @@
                 <w:b/>
                 <w:bCs/>
               </w:rPr>
-              <w:lastRenderedPageBreak/>
               <w:t>Identificación del requerimiento:</w:t>
             </w:r>
           </w:p>
@@ -8129,6 +8145,7 @@
                 <w:b/>
                 <w:bCs/>
               </w:rPr>
+              <w:lastRenderedPageBreak/>
               <w:t>Descripción del requerimiento:</w:t>
             </w:r>
           </w:p>
@@ -8230,7 +8247,6 @@
                 <w:b/>
                 <w:bCs/>
               </w:rPr>
-              <w:lastRenderedPageBreak/>
               <w:t>Identificación del requerimiento:</w:t>
             </w:r>
           </w:p>
@@ -8548,6 +8564,7 @@
                 <w:b/>
                 <w:bCs/>
               </w:rPr>
+              <w:lastRenderedPageBreak/>
               <w:t>Descripción del requerimiento:</w:t>
             </w:r>
           </w:p>
@@ -8647,7 +8664,6 @@
                 <w:b/>
                 <w:bCs/>
               </w:rPr>
-              <w:lastRenderedPageBreak/>
               <w:t>Identificación del requerimiento:</w:t>
             </w:r>
           </w:p>
@@ -8965,6 +8981,7 @@
                 <w:b/>
                 <w:bCs/>
               </w:rPr>
+              <w:lastRenderedPageBreak/>
               <w:t>Descripción del requerimiento:</w:t>
             </w:r>
           </w:p>
@@ -9064,7 +9081,6 @@
                 <w:b/>
                 <w:bCs/>
               </w:rPr>
-              <w:lastRenderedPageBreak/>
               <w:t>Identificación del requerimiento:</w:t>
             </w:r>
           </w:p>
@@ -9382,6 +9398,7 @@
                 <w:b/>
                 <w:bCs/>
               </w:rPr>
+              <w:lastRenderedPageBreak/>
               <w:t>Descripción del requerimiento:</w:t>
             </w:r>
           </w:p>
@@ -9481,7 +9498,6 @@
                 <w:b/>
                 <w:bCs/>
               </w:rPr>
-              <w:lastRenderedPageBreak/>
               <w:t>Identificación del requerimiento:</w:t>
             </w:r>
           </w:p>
@@ -9799,6 +9815,7 @@
                 <w:b/>
                 <w:bCs/>
               </w:rPr>
+              <w:lastRenderedPageBreak/>
               <w:t>Descripción del requerimiento:</w:t>
             </w:r>
           </w:p>
@@ -9899,7 +9916,6 @@
                 <w:b/>
                 <w:bCs/>
               </w:rPr>
-              <w:lastRenderedPageBreak/>
               <w:t>Identificación del requerimiento:</w:t>
             </w:r>
           </w:p>
@@ -10217,6 +10233,7 @@
                 <w:b/>
                 <w:bCs/>
               </w:rPr>
+              <w:lastRenderedPageBreak/>
               <w:t>Descripción del requerimiento:</w:t>
             </w:r>
           </w:p>
@@ -10322,7 +10339,6 @@
                 <w:b/>
                 <w:bCs/>
               </w:rPr>
-              <w:lastRenderedPageBreak/>
               <w:t>Identificación del requerimiento:</w:t>
             </w:r>
           </w:p>
@@ -10640,6 +10656,7 @@
                 <w:b/>
                 <w:bCs/>
               </w:rPr>
+              <w:lastRenderedPageBreak/>
               <w:t>Descripción del requerimiento:</w:t>
             </w:r>
           </w:p>
@@ -10739,7 +10756,6 @@
                 <w:b/>
                 <w:bCs/>
               </w:rPr>
-              <w:lastRenderedPageBreak/>
               <w:t>Identificación del requerimiento:</w:t>
             </w:r>
           </w:p>
@@ -11060,6 +11076,7 @@
                 <w:b/>
                 <w:bCs/>
               </w:rPr>
+              <w:lastRenderedPageBreak/>
               <w:t>Descripción del requerimiento:</w:t>
             </w:r>
           </w:p>
@@ -11159,7 +11176,6 @@
                 <w:b/>
                 <w:bCs/>
               </w:rPr>
-              <w:lastRenderedPageBreak/>
               <w:t>Identificación del requerimiento:</w:t>
             </w:r>
           </w:p>
@@ -11477,6 +11493,7 @@
                 <w:b/>
                 <w:bCs/>
               </w:rPr>
+              <w:lastRenderedPageBreak/>
               <w:t>Descripción del requerimiento:</w:t>
             </w:r>
           </w:p>
@@ -11576,7 +11593,6 @@
                 <w:b/>
                 <w:bCs/>
               </w:rPr>
-              <w:lastRenderedPageBreak/>
               <w:t>Identificación del requerimiento:</w:t>
             </w:r>
           </w:p>
@@ -11894,6 +11910,7 @@
                 <w:b/>
                 <w:bCs/>
               </w:rPr>
+              <w:lastRenderedPageBreak/>
               <w:t>Descripción del requerimiento:</w:t>
             </w:r>
           </w:p>
@@ -11993,7 +12010,6 @@
                 <w:b/>
                 <w:bCs/>
               </w:rPr>
-              <w:lastRenderedPageBreak/>
               <w:t>Identificación del requerimiento:</w:t>
             </w:r>
           </w:p>
@@ -12311,6 +12327,7 @@
                 <w:b/>
                 <w:bCs/>
               </w:rPr>
+              <w:lastRenderedPageBreak/>
               <w:t>Descripción del requerimiento:</w:t>
             </w:r>
           </w:p>
@@ -12412,7 +12429,6 @@
                 <w:b/>
                 <w:bCs/>
               </w:rPr>
-              <w:lastRenderedPageBreak/>
               <w:t>Identificación del requerimiento:</w:t>
             </w:r>
           </w:p>
@@ -12697,6 +12713,7 @@
                 <w:b/>
                 <w:bCs/>
               </w:rPr>
+              <w:lastRenderedPageBreak/>
               <w:t>Características:</w:t>
             </w:r>
           </w:p>
@@ -12829,7 +12846,6 @@
                 <w:b/>
                 <w:bCs/>
               </w:rPr>
-              <w:lastRenderedPageBreak/>
               <w:t>Identificación del requerimiento:</w:t>
             </w:r>
           </w:p>
@@ -13114,6 +13130,7 @@
                 <w:b/>
                 <w:bCs/>
               </w:rPr>
+              <w:lastRenderedPageBreak/>
               <w:t>Características:</w:t>
             </w:r>
           </w:p>
@@ -13246,7 +13263,6 @@
                 <w:b/>
                 <w:bCs/>
               </w:rPr>
-              <w:lastRenderedPageBreak/>
               <w:t>Identificación del requerimiento:</w:t>
             </w:r>
           </w:p>
@@ -13531,6 +13547,7 @@
                 <w:b/>
                 <w:bCs/>
               </w:rPr>
+              <w:lastRenderedPageBreak/>
               <w:t>Características:</w:t>
             </w:r>
           </w:p>
@@ -13663,7 +13680,6 @@
                 <w:b/>
                 <w:bCs/>
               </w:rPr>
-              <w:lastRenderedPageBreak/>
               <w:t>Identificación del requerimiento:</w:t>
             </w:r>
           </w:p>
@@ -13948,6 +13964,7 @@
                 <w:b/>
                 <w:bCs/>
               </w:rPr>
+              <w:lastRenderedPageBreak/>
               <w:t>Características:</w:t>
             </w:r>
           </w:p>
@@ -14080,7 +14097,6 @@
                 <w:b/>
                 <w:bCs/>
               </w:rPr>
-              <w:lastRenderedPageBreak/>
               <w:t>Identificación del requerimiento:</w:t>
             </w:r>
           </w:p>
@@ -14365,6 +14381,7 @@
                 <w:b/>
                 <w:bCs/>
               </w:rPr>
+              <w:lastRenderedPageBreak/>
               <w:t>Características:</w:t>
             </w:r>
           </w:p>
@@ -14498,7 +14515,6 @@
                 <w:b/>
                 <w:bCs/>
               </w:rPr>
-              <w:lastRenderedPageBreak/>
               <w:t>Identificación del requerimiento:</w:t>
             </w:r>
           </w:p>
@@ -14715,6 +14731,7 @@
                 <w:b/>
                 <w:bCs/>
               </w:rPr>
+              <w:lastRenderedPageBreak/>
               <w:t>Identificación del requerimiento:</w:t>
             </w:r>
           </w:p>
@@ -15815,7 +15832,6 @@
                 <w:b/>
                 <w:bCs/>
               </w:rPr>
-              <w:lastRenderedPageBreak/>
               <w:t>Identificación del requerimiento:</w:t>
             </w:r>
           </w:p>
@@ -16232,7 +16248,6 @@
                 <w:b/>
                 <w:bCs/>
               </w:rPr>
-              <w:lastRenderedPageBreak/>
               <w:t>Identificación del requerimiento:</w:t>
             </w:r>
           </w:p>
@@ -16441,6 +16456,7 @@
                 <w:b/>
                 <w:bCs/>
               </w:rPr>
+              <w:lastRenderedPageBreak/>
               <w:t>Identificación del requerimiento:</w:t>
             </w:r>
           </w:p>
@@ -16649,7 +16665,6 @@
                 <w:b/>
                 <w:bCs/>
               </w:rPr>
-              <w:lastRenderedPageBreak/>
               <w:t>Identificación del requerimiento:</w:t>
             </w:r>
           </w:p>
@@ -16858,6 +16873,7 @@
                 <w:b/>
                 <w:bCs/>
               </w:rPr>
+              <w:lastRenderedPageBreak/>
               <w:t>Identificación del requerimiento:</w:t>
             </w:r>
           </w:p>
@@ -17067,7 +17083,6 @@
                 <w:b/>
                 <w:bCs/>
               </w:rPr>
-              <w:lastRenderedPageBreak/>
               <w:t>Identificación del requerimiento:</w:t>
             </w:r>
           </w:p>
@@ -17276,6 +17291,7 @@
                 <w:b/>
                 <w:bCs/>
               </w:rPr>
+              <w:lastRenderedPageBreak/>
               <w:t>Identificación del requerimiento:</w:t>
             </w:r>
           </w:p>
@@ -17485,7 +17501,6 @@
                 <w:b/>
                 <w:bCs/>
               </w:rPr>
-              <w:lastRenderedPageBreak/>
               <w:t>Identificación del requerimiento:</w:t>
             </w:r>
           </w:p>
@@ -17694,6 +17709,7 @@
                 <w:b/>
                 <w:bCs/>
               </w:rPr>
+              <w:lastRenderedPageBreak/>
               <w:t>Identificación del requerimiento:</w:t>
             </w:r>
           </w:p>
@@ -17866,7 +17882,7 @@
 </file>
 
 <file path=word/styles.xml><?xml version="1.0" encoding="utf-8"?>
-<w:styles xmlns:mc="http://schemas.openxmlformats.org/markup-compatibility/2006" xmlns:r="http://schemas.openxmlformats.org/officeDocument/2006/relationships" xmlns:w="http://schemas.openxmlformats.org/wordprocessingml/2006/main" xmlns:w14="http://schemas.microsoft.com/office/word/2010/wordml" xmlns:w15="http://schemas.microsoft.com/office/word/2012/wordml" xmlns:w16cex="http://schemas.microsoft.com/office/word/2018/wordml/cex" xmlns:w16cid="http://schemas.microsoft.com/office/word/2016/wordml/cid" xmlns:w16="http://schemas.microsoft.com/office/word/2018/wordml" xmlns:w16sdtdh="http://schemas.microsoft.com/office/word/2020/wordml/sdtdatahash" xmlns:w16se="http://schemas.microsoft.com/office/word/2015/wordml/symex" mc:Ignorable="w14 w15 w16se w16cid w16 w16cex w16sdtdh">
+<w:styles xmlns:mc="http://schemas.openxmlformats.org/markup-compatibility/2006" xmlns:r="http://schemas.openxmlformats.org/officeDocument/2006/relationships" xmlns:w="http://schemas.openxmlformats.org/wordprocessingml/2006/main" xmlns:w14="http://schemas.microsoft.com/office/word/2010/wordml" xmlns:w15="http://schemas.microsoft.com/office/word/2012/wordml" xmlns:w16cex="http://schemas.microsoft.com/office/word/2018/wordml/cex" xmlns:w16cid="http://schemas.microsoft.com/office/word/2016/wordml/cid" xmlns:w16="http://schemas.microsoft.com/office/word/2018/wordml" xmlns:w16du="http://schemas.microsoft.com/office/word/2023/wordml/word16du" xmlns:w16sdtdh="http://schemas.microsoft.com/office/word/2020/wordml/sdtdatahash" xmlns:w16sdtfl="http://schemas.microsoft.com/office/word/2024/wordml/sdtformatlock" xmlns:w16se="http://schemas.microsoft.com/office/word/2015/wordml/symex" mc:Ignorable="w14 w15 w16se w16cid w16 w16cex w16sdtdh w16sdtfl w16du">
   <w:docDefaults>
     <w:rPrDefault>
       <w:rPr>

</xml_diff>